<commit_message>
formatos cambiados listo para subir a produccion
</commit_message>
<xml_diff>
--- a/public/report_templates/caja/reportes/rptDeclaracionJurada.docx
+++ b/public/report_templates/caja/reportes/rptDeclaracionJurada.docx
@@ -14,26 +14,21 @@
       </w:pPr>
       <w:r>
         <w:rPr>
-          <w:rFonts w:ascii="Berlin Sans FB" w:eastAsia="Batang" w:hAnsi="Berlin Sans FB" w:cs="Arial"/>
           <w:noProof/>
-          <w:sz w:val="20"/>
-          <w:szCs w:val="22"/>
-          <w:u w:val="single"/>
-          <w:lang w:val="es-PE" w:eastAsia="es-PE"/>
         </w:rPr>
         <w:drawing>
-          <wp:anchor distT="0" distB="0" distL="114300" distR="114300" simplePos="0" relativeHeight="251662848" behindDoc="0" locked="0" layoutInCell="1" allowOverlap="1" wp14:anchorId="01ED80F9" wp14:editId="5485AB32">
+          <wp:anchor distT="0" distB="0" distL="114300" distR="114300" simplePos="0" relativeHeight="251662848" behindDoc="0" locked="0" layoutInCell="1" allowOverlap="1" wp14:anchorId="3351DD2C" wp14:editId="5BECB402">
             <wp:simplePos x="0" y="0"/>
             <wp:positionH relativeFrom="margin">
-              <wp:posOffset>57150</wp:posOffset>
+              <wp:posOffset>161925</wp:posOffset>
             </wp:positionH>
             <wp:positionV relativeFrom="paragraph">
-              <wp:posOffset>-8890</wp:posOffset>
+              <wp:posOffset>635</wp:posOffset>
             </wp:positionV>
-            <wp:extent cx="1457325" cy="549358"/>
+            <wp:extent cx="1657350" cy="485118"/>
             <wp:effectExtent l="0" t="0" r="0" b="0"/>
             <wp:wrapNone/>
-            <wp:docPr id="1" name="Imagen 1"/>
+            <wp:docPr id="2" name="Imagen 2"/>
             <wp:cNvGraphicFramePr>
               <a:graphicFrameLocks xmlns:a="http://schemas.openxmlformats.org/drawingml/2006/main" noChangeAspect="1"/>
             </wp:cNvGraphicFramePr>
@@ -62,7 +57,7 @@
                   <pic:spPr bwMode="auto">
                     <a:xfrm>
                       <a:off x="0" y="0"/>
-                      <a:ext cx="1457325" cy="549358"/>
+                      <a:ext cx="1657350" cy="485118"/>
                     </a:xfrm>
                     <a:prstGeom prst="rect">
                       <a:avLst/>
@@ -735,7 +730,7 @@
           <w:sz w:val="18"/>
           <w:szCs w:val="18"/>
         </w:rPr>
-        <w:t>CREDIPYME HUANCA SAC</w:t>
+        <w:t>CREDIPYME HUANCA S</w:t>
       </w:r>
       <w:r>
         <w:rPr>
@@ -744,6 +739,42 @@
           <w:sz w:val="18"/>
           <w:szCs w:val="18"/>
         </w:rPr>
+        <w:t>.</w:t>
+      </w:r>
+      <w:r>
+        <w:rPr>
+          <w:rFonts w:ascii="Verdana" w:eastAsia="Batang" w:hAnsi="Verdana"/>
+          <w:b/>
+          <w:sz w:val="18"/>
+          <w:szCs w:val="18"/>
+        </w:rPr>
+        <w:t>A</w:t>
+      </w:r>
+      <w:r>
+        <w:rPr>
+          <w:rFonts w:ascii="Verdana" w:eastAsia="Batang" w:hAnsi="Verdana"/>
+          <w:b/>
+          <w:sz w:val="18"/>
+          <w:szCs w:val="18"/>
+        </w:rPr>
+        <w:t>.</w:t>
+      </w:r>
+      <w:r>
+        <w:rPr>
+          <w:rFonts w:ascii="Verdana" w:eastAsia="Batang" w:hAnsi="Verdana"/>
+          <w:b/>
+          <w:sz w:val="18"/>
+          <w:szCs w:val="18"/>
+        </w:rPr>
+        <w:t>C</w:t>
+      </w:r>
+      <w:r>
+        <w:rPr>
+          <w:rFonts w:ascii="Verdana" w:eastAsia="Batang" w:hAnsi="Verdana"/>
+          <w:b/>
+          <w:sz w:val="18"/>
+          <w:szCs w:val="18"/>
+        </w:rPr>
         <w:t xml:space="preserve">, </w:t>
       </w:r>
       <w:r>
@@ -752,7 +783,49 @@
           <w:sz w:val="18"/>
           <w:szCs w:val="18"/>
         </w:rPr>
-        <w:t>con dirección</w:t>
+        <w:t>con</w:t>
+      </w:r>
+      <w:r>
+        <w:rPr>
+          <w:rFonts w:ascii="Verdana" w:eastAsia="Batang" w:hAnsi="Verdana"/>
+          <w:sz w:val="18"/>
+          <w:szCs w:val="18"/>
+        </w:rPr>
+        <w:t xml:space="preserve"> RUC </w:t>
+      </w:r>
+      <w:r>
+        <w:rPr>
+          <w:rFonts w:ascii="Verdana" w:eastAsia="Batang" w:hAnsi="Verdana"/>
+          <w:b/>
+          <w:bCs/>
+          <w:sz w:val="18"/>
+          <w:szCs w:val="18"/>
+        </w:rPr>
+        <w:t>20614827239</w:t>
+      </w:r>
+      <w:r>
+        <w:rPr>
+          <w:rFonts w:ascii="Verdana" w:eastAsia="Batang" w:hAnsi="Verdana"/>
+          <w:sz w:val="18"/>
+          <w:szCs w:val="18"/>
+        </w:rPr>
+        <w:t xml:space="preserve"> </w:t>
+      </w:r>
+      <w:r>
+        <w:rPr>
+          <w:rFonts w:ascii="Verdana" w:eastAsia="Batang" w:hAnsi="Verdana"/>
+          <w:sz w:val="18"/>
+          <w:szCs w:val="18"/>
+        </w:rPr>
+        <w:t xml:space="preserve">y </w:t>
+      </w:r>
+      <w:r>
+        <w:rPr>
+          <w:rFonts w:ascii="Verdana" w:eastAsia="Batang" w:hAnsi="Verdana"/>
+          <w:sz w:val="18"/>
+          <w:szCs w:val="18"/>
+        </w:rPr>
+        <w:t>dirección</w:t>
       </w:r>
       <w:r>
         <w:rPr>
@@ -1346,6 +1419,7 @@
                 <w:szCs w:val="16"/>
               </w:rPr>
             </w:pPr>
+            <w:proofErr w:type="spellStart"/>
             <w:r>
               <w:rPr>
                 <w:rFonts w:ascii="Verdana" w:eastAsia="Batang" w:hAnsi="Verdana" w:cs="Arial"/>
@@ -1353,7 +1427,17 @@
                 <w:sz w:val="16"/>
                 <w:szCs w:val="16"/>
               </w:rPr>
-              <w:t xml:space="preserve">N° DNI: </w:t>
+              <w:t>N°</w:t>
+            </w:r>
+            <w:proofErr w:type="spellEnd"/>
+            <w:r>
+              <w:rPr>
+                <w:rFonts w:ascii="Verdana" w:eastAsia="Batang" w:hAnsi="Verdana" w:cs="Arial"/>
+                <w:bCs/>
+                <w:sz w:val="16"/>
+                <w:szCs w:val="16"/>
+              </w:rPr>
+              <w:t xml:space="preserve"> DNI: </w:t>
             </w:r>
             <w:r>
               <w:rPr>
@@ -1463,6 +1547,7 @@
                 <w:szCs w:val="16"/>
               </w:rPr>
             </w:pPr>
+            <w:proofErr w:type="spellStart"/>
             <w:r>
               <w:rPr>
                 <w:rFonts w:ascii="Verdana" w:eastAsia="Batang" w:hAnsi="Verdana" w:cs="Arial"/>
@@ -1470,7 +1555,17 @@
                 <w:sz w:val="16"/>
                 <w:szCs w:val="16"/>
               </w:rPr>
-              <w:t xml:space="preserve">N° DNI: </w:t>
+              <w:t>N°</w:t>
+            </w:r>
+            <w:proofErr w:type="spellEnd"/>
+            <w:r>
+              <w:rPr>
+                <w:rFonts w:ascii="Verdana" w:eastAsia="Batang" w:hAnsi="Verdana" w:cs="Arial"/>
+                <w:bCs/>
+                <w:sz w:val="16"/>
+                <w:szCs w:val="16"/>
+              </w:rPr>
+              <w:t xml:space="preserve"> DNI: </w:t>
             </w:r>
             <w:r>
               <w:rPr>
@@ -1589,6 +1684,7 @@
                 <w:szCs w:val="16"/>
               </w:rPr>
             </w:pPr>
+            <w:proofErr w:type="spellStart"/>
             <w:r>
               <w:rPr>
                 <w:rFonts w:ascii="Verdana" w:eastAsia="Batang" w:hAnsi="Verdana" w:cs="Arial"/>
@@ -1596,7 +1692,17 @@
                 <w:sz w:val="16"/>
                 <w:szCs w:val="16"/>
               </w:rPr>
-              <w:t xml:space="preserve">N° DNI: </w:t>
+              <w:t>N°</w:t>
+            </w:r>
+            <w:proofErr w:type="spellEnd"/>
+            <w:r>
+              <w:rPr>
+                <w:rFonts w:ascii="Verdana" w:eastAsia="Batang" w:hAnsi="Verdana" w:cs="Arial"/>
+                <w:bCs/>
+                <w:sz w:val="16"/>
+                <w:szCs w:val="16"/>
+              </w:rPr>
+              <w:t xml:space="preserve"> DNI: </w:t>
             </w:r>
             <w:r>
               <w:rPr>

</xml_diff>